<commit_message>
Update GitHub URL from infomat to infomat.app
Co-Authored-By: Claude Sonnet 4.6 <noreply@anthropic.com>
</commit_message>
<xml_diff>
--- a/shenime mbi mywebsite.docx
+++ b/shenime mbi mywebsite.docx
@@ -16,6 +16,10 @@
       </w:r>
       <w:proofErr w:type="spellStart"/>
       <w:r>
+        <w:rPr>
+          <w:b/>
+          <w:bCs/>
+        </w:rPr>
         <w:t>mywebsite</w:t>
       </w:r>
       <w:proofErr w:type="spellEnd"/>
@@ -26,17 +30,18 @@
       <w:r>
         <w:t>llogarin</w:t>
       </w:r>
-      <w:proofErr w:type="spellEnd"/>
-      <w:r>
-        <w:t xml:space="preserve"> </w:t>
-      </w:r>
-      <w:proofErr w:type="spellStart"/>
-      <w:r>
-        <w:t>Clude</w:t>
-      </w:r>
-      <w:proofErr w:type="spellEnd"/>
-      <w:r>
-        <w:t xml:space="preserve"> </w:t>
+      <w:r>
+        <w:t>e</w:t>
+      </w:r>
+      <w:proofErr w:type="spellEnd"/>
+      <w:r>
+        <w:t xml:space="preserve"> Cl</w:t>
+      </w:r>
+      <w:r>
+        <w:t>a</w:t>
+      </w:r>
+      <w:r>
+        <w:t xml:space="preserve">ude </w:t>
       </w:r>
       <w:hyperlink r:id="rId4" w:history="1">
         <w:r>
@@ -700,6 +705,117 @@
                     <a:xfrm>
                       <a:off x="0" y="0"/>
                       <a:ext cx="3077004" cy="7020905"/>
+                    </a:xfrm>
+                    <a:prstGeom prst="rect">
+                      <a:avLst/>
+                    </a:prstGeom>
+                  </pic:spPr>
+                </pic:pic>
+              </a:graphicData>
+            </a:graphic>
+          </wp:inline>
+        </w:drawing>
+      </w:r>
+    </w:p>
+    <w:p/>
+    <w:p/>
+    <w:p>
+      <w:pPr>
+        <w:rPr>
+          <w:b/>
+          <w:bCs/>
+        </w:rPr>
+      </w:pPr>
+      <w:r>
+        <w:rPr>
+          <w:b/>
+          <w:bCs/>
+        </w:rPr>
+        <w:br w:type="page"/>
+      </w:r>
+    </w:p>
+    <w:p>
+      <w:pPr>
+        <w:rPr>
+          <w:b/>
+          <w:bCs/>
+        </w:rPr>
+      </w:pPr>
+      <w:r>
+        <w:rPr>
+          <w:b/>
+          <w:bCs/>
+        </w:rPr>
+        <w:lastRenderedPageBreak/>
+        <w:t>https://resend.com/login</w:t>
+      </w:r>
+    </w:p>
+    <w:p>
+      <w:r>
+        <w:drawing>
+          <wp:inline distT="0" distB="0" distL="0" distR="0" wp14:anchorId="48F9DDE1" wp14:editId="0CFD92BA">
+            <wp:extent cx="5943600" cy="3016885"/>
+            <wp:effectExtent l="0" t="0" r="0" b="0"/>
+            <wp:docPr id="6" name="Picture 6"/>
+            <wp:cNvGraphicFramePr>
+              <a:graphicFrameLocks xmlns:a="http://schemas.openxmlformats.org/drawingml/2006/main" noChangeAspect="1"/>
+            </wp:cNvGraphicFramePr>
+            <a:graphic xmlns:a="http://schemas.openxmlformats.org/drawingml/2006/main">
+              <a:graphicData uri="http://schemas.openxmlformats.org/drawingml/2006/picture">
+                <pic:pic xmlns:pic="http://schemas.openxmlformats.org/drawingml/2006/picture">
+                  <pic:nvPicPr>
+                    <pic:cNvPr id="1" name=""/>
+                    <pic:cNvPicPr/>
+                  </pic:nvPicPr>
+                  <pic:blipFill>
+                    <a:blip r:embed="rId12"/>
+                    <a:stretch>
+                      <a:fillRect/>
+                    </a:stretch>
+                  </pic:blipFill>
+                  <pic:spPr>
+                    <a:xfrm>
+                      <a:off x="0" y="0"/>
+                      <a:ext cx="5943600" cy="3016885"/>
+                    </a:xfrm>
+                    <a:prstGeom prst="rect">
+                      <a:avLst/>
+                    </a:prstGeom>
+                  </pic:spPr>
+                </pic:pic>
+              </a:graphicData>
+            </a:graphic>
+          </wp:inline>
+        </w:drawing>
+      </w:r>
+    </w:p>
+    <w:p>
+      <w:r>
+        <w:drawing>
+          <wp:inline distT="0" distB="0" distL="0" distR="0" wp14:anchorId="0569AC85" wp14:editId="5BEF1ADA">
+            <wp:extent cx="5943600" cy="3016885"/>
+            <wp:effectExtent l="0" t="0" r="0" b="0"/>
+            <wp:docPr id="5" name="Picture 5"/>
+            <wp:cNvGraphicFramePr>
+              <a:graphicFrameLocks xmlns:a="http://schemas.openxmlformats.org/drawingml/2006/main" noChangeAspect="1"/>
+            </wp:cNvGraphicFramePr>
+            <a:graphic xmlns:a="http://schemas.openxmlformats.org/drawingml/2006/main">
+              <a:graphicData uri="http://schemas.openxmlformats.org/drawingml/2006/picture">
+                <pic:pic xmlns:pic="http://schemas.openxmlformats.org/drawingml/2006/picture">
+                  <pic:nvPicPr>
+                    <pic:cNvPr id="1" name=""/>
+                    <pic:cNvPicPr/>
+                  </pic:nvPicPr>
+                  <pic:blipFill>
+                    <a:blip r:embed="rId12"/>
+                    <a:stretch>
+                      <a:fillRect/>
+                    </a:stretch>
+                  </pic:blipFill>
+                  <pic:spPr>
+                    <a:xfrm>
+                      <a:off x="0" y="0"/>
+                      <a:ext cx="5943600" cy="3016885"/>
                     </a:xfrm>
                     <a:prstGeom prst="rect">
                       <a:avLst/>
@@ -1124,7 +1240,6 @@
   <w:style w:type="character" w:default="1" w:styleId="DefaultParagraphFont">
     <w:name w:val="Default Paragraph Font"/>
     <w:uiPriority w:val="1"/>
-    <w:semiHidden/>
     <w:unhideWhenUsed/>
   </w:style>
   <w:style w:type="table" w:default="1" w:styleId="TableNormal">
@@ -1169,6 +1284,19 @@
     <w:rPr>
       <w:color w:val="605E5C"/>
       <w:shd w:val="clear" w:color="auto" w:fill="E1DFDD"/>
+    </w:rPr>
+  </w:style>
+  <w:style w:type="paragraph" w:customStyle="1" w:styleId="text-xs">
+    <w:name w:val="text-xs"/>
+    <w:basedOn w:val="Normal"/>
+    <w:rsid w:val="00796533"/>
+    <w:pPr>
+      <w:spacing w:before="100" w:beforeAutospacing="1" w:after="100" w:afterAutospacing="1" w:line="240" w:lineRule="auto"/>
+    </w:pPr>
+    <w:rPr>
+      <w:rFonts w:ascii="Times New Roman" w:eastAsia="Times New Roman" w:hAnsi="Times New Roman" w:cs="Times New Roman"/>
+      <w:sz w:val="24"/>
+      <w:szCs w:val="24"/>
     </w:rPr>
   </w:style>
 </w:styles>

</xml_diff>